<commit_message>
docs: giải thích {{double}} vs {single} brace trong guide Docs
Phản hồi Nhung (Docs) confused tại sao guide bảo {{contract_no}} (2 ngoặc) trong
khi chị thấy template cũ trong máy dùng {contract_no} (1 ngoặc).

Thêm section "Tại sao 2 ngoặc thay vì 1?" ở ĐẦU guide (trước "Vì sao phải đổi"):
- Giải thích {single} = compose flow CŨ deprecated, ERP tự render full HĐ
- {{double}} = upload flow MỚI, ERP chỉ fill 6 trường
- Action cho Docs:
  1. Đổi {tok} → {{tok}} cho 6 token chính
  2. Token CŨ khác (buyer_name/grade/quantity/...) → XÓA, gõ value thật per HĐ
- Quick check Ctrl+F tìm "{" trong template

Update cả .md + .docx + script regenerate (python-docx). Anh gửi lại file
.docx cho Nhung.

Co-Authored-By: Claude Opus 4.7 <noreply@anthropic.com>
</commit_message>
<xml_diff>
--- a/docs/HUONG_DAN_DOCS_TEMPLATE_HOP_DONG.docx
+++ b/docs/HUONG_DAN_DOCS_TEMPLATE_HOP_DONG.docx
@@ -94,6 +94,327 @@
         <w:t>ERP System · huyanhrubber.vn</w:t>
       </w:r>
     </w:p>
+    <w:p>
+      <w:r>
+        <w:br w:type="page"/>
+      </w:r>
+    </w:p>
+    <w:p>
+      <w:pPr>
+        <w:pStyle w:val="Heading1"/>
+      </w:pPr>
+      <w:r>
+        <w:rPr>
+          <w:color w:val="DC2626"/>
+        </w:rPr>
+        <w:t>Tại sao 2 ngoặc {{...}} thay vì 1 ngoặc {...}?</w:t>
+      </w:r>
+    </w:p>
+    <w:tbl>
+      <w:tblPr>
+        <w:tblW w:type="auto" w:w="0"/>
+        <w:tblLook w:firstColumn="1" w:firstRow="1" w:lastColumn="0" w:lastRow="0" w:noHBand="0" w:noVBand="1" w:val="04A0"/>
+      </w:tblPr>
+      <w:tblGrid>
+        <w:gridCol w:w="9972"/>
+      </w:tblGrid>
+      <w:tr>
+        <w:tc>
+          <w:tcPr>
+            <w:tcW w:type="dxa" w:w="9972"/>
+            <w:shd w:val="clear" w:color="auto" w:fill="FEE2E2"/>
+          </w:tcPr>
+          <w:p>
+            <w:pPr>
+              <w:spacing w:after="40"/>
+            </w:pPr>
+            <w:r>
+              <w:rPr>
+                <w:b/>
+                <w:color w:val="DC2626"/>
+                <w:sz w:val="22"/>
+              </w:rPr>
+              <w:t>⚠ Lưu ý quan trọng</w:t>
+            </w:r>
+          </w:p>
+          <w:p>
+            <w:pPr>
+              <w:spacing w:before="40"/>
+            </w:pPr>
+            <w:r>
+              <w:rPr>
+                <w:sz w:val="20"/>
+              </w:rPr>
+              <w:t>Nhung/Phương Anh có thể đã thấy các template CŨ trong máy với {contract_no}, {contract_date}... (1 ngoặc). Đó là format compose flow CŨ (deprecated) — ERP cũ tự render TOÀN BỘ HĐ. Workflow đó không còn dùng.</w:t>
+            </w:r>
+          </w:p>
+        </w:tc>
+      </w:tr>
+    </w:tbl>
+    <w:p/>
+    <w:p>
+      <w:r>
+        <w:rPr>
+          <w:b/>
+          <w:i w:val="0"/>
+          <w:sz w:val="22"/>
+        </w:rPr>
+        <w:t>Workflow MỚI (upload flow) — Docs upload file, ERP chỉ fill 6 trường — bắt buộc dùng 2 ngoặc:</w:t>
+      </w:r>
+    </w:p>
+    <w:tbl>
+      <w:tblPr>
+        <w:tblStyle w:val="LightGrid-Accent1"/>
+        <w:tblW w:type="auto" w:w="0"/>
+        <w:tblLook w:firstColumn="1" w:firstRow="1" w:lastColumn="0" w:lastRow="0" w:noHBand="0" w:noVBand="1" w:val="04A0"/>
+      </w:tblPr>
+      <w:tblGrid>
+        <w:gridCol w:w="3324"/>
+        <w:gridCol w:w="3324"/>
+        <w:gridCol w:w="3324"/>
+      </w:tblGrid>
+      <w:tr>
+        <w:tc>
+          <w:tcPr>
+            <w:tcW w:type="dxa" w:w="2268"/>
+            <w:shd w:val="clear" w:color="auto" w:fill="1B4D3E"/>
+          </w:tcPr>
+          <w:p>
+            <w:pPr>
+              <w:spacing w:before="40" w:after="40"/>
+            </w:pPr>
+            <w:r>
+              <w:rPr>
+                <w:b/>
+                <w:color w:val="FFFFFF"/>
+                <w:sz w:val="20"/>
+              </w:rPr>
+              <w:t>Format</w:t>
+            </w:r>
+          </w:p>
+        </w:tc>
+        <w:tc>
+          <w:tcPr>
+            <w:tcW w:type="dxa" w:w="4535"/>
+            <w:shd w:val="clear" w:color="auto" w:fill="1B4D3E"/>
+          </w:tcPr>
+          <w:p>
+            <w:pPr>
+              <w:spacing w:before="40" w:after="40"/>
+            </w:pPr>
+            <w:r>
+              <w:rPr>
+                <w:b/>
+                <w:color w:val="FFFFFF"/>
+                <w:sz w:val="20"/>
+              </w:rPr>
+              <w:t>Ý nghĩa</w:t>
+            </w:r>
+          </w:p>
+        </w:tc>
+        <w:tc>
+          <w:tcPr>
+            <w:tcW w:type="dxa" w:w="2835"/>
+            <w:shd w:val="clear" w:color="auto" w:fill="1B4D3E"/>
+          </w:tcPr>
+          <w:p>
+            <w:pPr>
+              <w:spacing w:before="40" w:after="40"/>
+            </w:pPr>
+            <w:r>
+              <w:rPr>
+                <w:b/>
+                <w:color w:val="FFFFFF"/>
+                <w:sz w:val="20"/>
+              </w:rPr>
+              <w:t>Khi nào dùng</w:t>
+            </w:r>
+          </w:p>
+        </w:tc>
+      </w:tr>
+      <w:tr>
+        <w:tc>
+          <w:tcPr>
+            <w:tcW w:type="dxa" w:w="2268"/>
+          </w:tcPr>
+          <w:p>
+            <w:r>
+              <w:rPr>
+                <w:sz w:val="18"/>
+              </w:rPr>
+              <w:t>{contract_no}</w:t>
+              <w:br/>
+              <w:t>(1 ngoặc)</w:t>
+            </w:r>
+          </w:p>
+        </w:tc>
+        <w:tc>
+          <w:tcPr>
+            <w:tcW w:type="dxa" w:w="4535"/>
+          </w:tcPr>
+          <w:p>
+            <w:r>
+              <w:rPr>
+                <w:sz w:val="18"/>
+              </w:rPr>
+              <w:t>Format CŨ (compose flow deprecated) — ERP cũ tự render full HĐ</w:t>
+            </w:r>
+          </w:p>
+        </w:tc>
+        <w:tc>
+          <w:tcPr>
+            <w:tcW w:type="dxa" w:w="2835"/>
+          </w:tcPr>
+          <w:p>
+            <w:r>
+              <w:rPr>
+                <w:sz w:val="18"/>
+              </w:rPr>
+              <w:t>Đừng dùng cho HĐ mới</w:t>
+            </w:r>
+          </w:p>
+        </w:tc>
+      </w:tr>
+      <w:tr>
+        <w:tc>
+          <w:tcPr>
+            <w:tcW w:type="dxa" w:w="2268"/>
+            <w:shd w:val="clear" w:color="auto" w:fill="F9FAFB"/>
+          </w:tcPr>
+          <w:p>
+            <w:r>
+              <w:rPr>
+                <w:sz w:val="18"/>
+              </w:rPr>
+              <w:t>{{contract_no}}</w:t>
+              <w:br/>
+              <w:t>(2 ngoặc)</w:t>
+            </w:r>
+          </w:p>
+        </w:tc>
+        <w:tc>
+          <w:tcPr>
+            <w:tcW w:type="dxa" w:w="4535"/>
+            <w:shd w:val="clear" w:color="auto" w:fill="F9FAFB"/>
+          </w:tcPr>
+          <w:p>
+            <w:r>
+              <w:rPr>
+                <w:sz w:val="18"/>
+              </w:rPr>
+              <w:t>Format MỚI (upload flow) — ERP chỉ fill 6 trường</w:t>
+            </w:r>
+          </w:p>
+        </w:tc>
+        <w:tc>
+          <w:tcPr>
+            <w:tcW w:type="dxa" w:w="2835"/>
+            <w:shd w:val="clear" w:color="auto" w:fill="F9FAFB"/>
+          </w:tcPr>
+          <w:p>
+            <w:r>
+              <w:rPr>
+                <w:sz w:val="18"/>
+              </w:rPr>
+              <w:t>Dùng cho mọi HĐ từ giờ</w:t>
+            </w:r>
+          </w:p>
+        </w:tc>
+      </w:tr>
+    </w:tbl>
+    <w:p/>
+    <w:p>
+      <w:pPr>
+        <w:pStyle w:val="Heading3"/>
+      </w:pPr>
+      <w:r>
+        <w:t>Lý do dùng 2 ngoặc:</w:t>
+      </w:r>
+    </w:p>
+    <w:p>
+      <w:r>
+        <w:rPr>
+          <w:b w:val="0"/>
+          <w:i w:val="0"/>
+          <w:sz w:val="22"/>
+        </w:rPr>
+        <w:t>Tránh nhầm với các text bình thường có dấu { hoặc } trong HĐ (vd: ghi chú, công thức, ký hiệu). 2 ngoặc gần như không bao giờ xuất hiện ngẫu nhiên trong HĐ thực tế.</w:t>
+      </w:r>
+    </w:p>
+    <w:p>
+      <w:pPr>
+        <w:pStyle w:val="Heading3"/>
+      </w:pPr>
+      <w:r>
+        <w:t>Action cho chị Nhung/Phương Anh:</w:t>
+      </w:r>
+    </w:p>
+    <w:p>
+      <w:pPr>
+        <w:pStyle w:val="ListNumber"/>
+      </w:pPr>
+      <w:r>
+        <w:t>Nếu template hiện tại có {contract_no} (1 ngoặc) → đổi thành {{contract_no}} (2 ngoặc) — chỉ cần thêm 1 ngoặc mỗi bên</w:t>
+      </w:r>
+    </w:p>
+    <w:p>
+      <w:pPr>
+        <w:pStyle w:val="ListNumber"/>
+      </w:pPr>
+      <w:r>
+        <w:t>Áp dụng tương tự cho 5 token bank (xem bảng bên dưới)</w:t>
+      </w:r>
+    </w:p>
+    <w:p>
+      <w:pPr>
+        <w:pStyle w:val="ListNumber"/>
+      </w:pPr>
+      <w:r>
+        <w:t>Các token CŨ khác (vd: {buyer_name}, {grade}, {quantity}...) → XÓA và gõ giá trị THẬT vào per HĐ. Workflow mới Docs custom HĐ theo từng khách, ERP không tự fill các trường này.</w:t>
+      </w:r>
+    </w:p>
+    <w:tbl>
+      <w:tblPr>
+        <w:tblW w:type="auto" w:w="0"/>
+        <w:tblLook w:firstColumn="1" w:firstRow="1" w:lastColumn="0" w:lastRow="0" w:noHBand="0" w:noVBand="1" w:val="04A0"/>
+      </w:tblPr>
+      <w:tblGrid>
+        <w:gridCol w:w="9972"/>
+      </w:tblGrid>
+      <w:tr>
+        <w:tc>
+          <w:tcPr>
+            <w:tcW w:type="dxa" w:w="9972"/>
+            <w:shd w:val="clear" w:color="auto" w:fill="E0F2FE"/>
+          </w:tcPr>
+          <w:p>
+            <w:pPr>
+              <w:spacing w:after="40"/>
+            </w:pPr>
+            <w:r>
+              <w:rPr>
+                <w:b/>
+                <w:color w:val="1D4ED8"/>
+                <w:sz w:val="22"/>
+              </w:rPr>
+              <w:t>💡 Quick check</w:t>
+            </w:r>
+          </w:p>
+          <w:p>
+            <w:pPr>
+              <w:spacing w:before="40"/>
+            </w:pPr>
+            <w:r>
+              <w:rPr>
+                <w:sz w:val="20"/>
+              </w:rPr>
+              <w:t>Trong Word bấm Ctrl+F → tìm "{" (1 ngoặc) → nếu còn token nào dạng 1 ngoặc trong template chính, sửa hết thành 2 ngoặc cho 6 token chính, hoặc thay bằng giá trị thật cho các token khác.</w:t>
+            </w:r>
+          </w:p>
+        </w:tc>
+      </w:tr>
+    </w:tbl>
+    <w:p/>
     <w:p>
       <w:r>
         <w:br w:type="page"/>

</xml_diff>